<commit_message>
Simplify intern edit guide to download + ask AI.
Drop the long file/deploy steps; point people to ZIP download, Cursor/Claude, and Drive or their own Vercel if needed.

Co-authored-by: Cursor <cursoragent@cursor.com>
</commit_message>
<xml_diff>
--- a/docs/메뉴얼_수정_가이드_인턴용.docx
+++ b/docs/메뉴얼_수정_가이드_인턴용.docx
@@ -4,7 +4,7 @@
   <w:body>
     <w:p>
       <w:pPr>
-        <w:spacing w:after="160" w:line="324" w:lineRule="auto"/>
+        <w:spacing w:after="120" w:line="336" w:lineRule="auto"/>
         <w:jc w:val="center"/>
       </w:pPr>
       <w:r>
@@ -12,14 +12,14 @@
           <w:rFonts w:ascii="맑은 고딕" w:hAnsi="맑은 고딕" w:eastAsia="맑은 고딕"/>
           <w:b/>
           <w:color w:val="1C1C1C"/>
-          <w:sz w:val="44"/>
+          <w:sz w:val="40"/>
         </w:rPr>
         <w:t>WAC 창고 메뉴얼 — 수정 가이드</w:t>
       </w:r>
     </w:p>
     <w:p>
       <w:pPr>
-        <w:spacing w:after="400" w:line="324" w:lineRule="auto"/>
+        <w:spacing w:after="360" w:line="336" w:lineRule="auto"/>
         <w:jc w:val="center"/>
       </w:pPr>
       <w:r>
@@ -29,26 +29,54 @@
           <w:color w:val="646464"/>
           <w:sz w:val="24"/>
         </w:rPr>
-        <w:t>다음 인턴·담당자용 (쉽게 고치는 방법)</w:t>
+        <w:t>인턴용 · 복잡하게 안 해도 됩니다</w:t>
       </w:r>
     </w:p>
     <w:p>
       <w:pPr>
-        <w:spacing w:after="200" w:line="324" w:lineRule="auto"/>
+        <w:spacing w:after="160" w:line="336" w:lineRule="auto"/>
       </w:pPr>
       <w:r>
         <w:rPr>
           <w:rFonts w:ascii="맑은 고딕" w:hAnsi="맑은 고딕" w:eastAsia="맑은 고딕"/>
           <w:b/>
           <w:color w:val="1C1C1C"/>
-          <w:sz w:val="32"/>
+          <w:sz w:val="30"/>
         </w:rPr>
-        <w:t>1. 이게 뭔가요?</w:t>
+        <w:t>한 줄 요약</w:t>
       </w:r>
     </w:p>
     <w:p>
       <w:pPr>
-        <w:spacing w:after="80" w:line="324" w:lineRule="auto"/>
+        <w:spacing w:after="280" w:line="336" w:lineRule="auto"/>
+      </w:pPr>
+      <w:r>
+        <w:rPr>
+          <w:rFonts w:ascii="맑은 고딕" w:hAnsi="맑은 고딕" w:eastAsia="맑은 고딕"/>
+          <w:b/>
+          <w:color w:val="1C1C1C"/>
+          <w:sz w:val="22"/>
+        </w:rPr>
+        <w:t>GitHub에서 파일 받고 → Cursor / Claude Code 같은 AI한테 『이거 고쳐줘』라고 말하면 됩니다.</w:t>
+      </w:r>
+    </w:p>
+    <w:p>
+      <w:pPr>
+        <w:spacing w:after="160" w:line="336" w:lineRule="auto"/>
+      </w:pPr>
+      <w:r>
+        <w:rPr>
+          <w:rFonts w:ascii="맑은 고딕" w:hAnsi="맑은 고딕" w:eastAsia="맑은 고딕"/>
+          <w:b/>
+          <w:color w:val="1C1C1C"/>
+          <w:sz w:val="30"/>
+        </w:rPr>
+        <w:t>1. 파일 받기</w:t>
+      </w:r>
+    </w:p>
+    <w:p>
+      <w:pPr>
+        <w:spacing w:after="80" w:line="336" w:lineRule="auto"/>
       </w:pPr>
       <w:r>
         <w:rPr>
@@ -57,40 +85,12 @@
           <w:color w:val="1C1C1C"/>
           <w:sz w:val="22"/>
         </w:rPr>
-        <w:t>창고 업무 전자 메뉴얼 웹사이트입니다. 주소는 아래와 같습니다.</w:t>
+        <w:t>메뉴얼 원본은 여기 있습니다.</w:t>
       </w:r>
     </w:p>
     <w:p>
       <w:pPr>
-        <w:spacing w:after="160" w:line="324" w:lineRule="auto"/>
-      </w:pPr>
-      <w:r>
-        <w:rPr>
-          <w:rFonts w:ascii="맑은 고딕" w:hAnsi="맑은 고딕" w:eastAsia="맑은 고딕"/>
-          <w:b/>
-          <w:color w:val="1C1C1C"/>
-          <w:sz w:val="22"/>
-        </w:rPr>
-        <w:t>https://wac-warehouse-manual.vercel.app</w:t>
-      </w:r>
-    </w:p>
-    <w:p>
-      <w:pPr>
-        <w:spacing w:after="80" w:line="324" w:lineRule="auto"/>
-      </w:pPr>
-      <w:r>
-        <w:rPr>
-          <w:rFonts w:ascii="맑은 고딕" w:hAnsi="맑은 고딕" w:eastAsia="맑은 고딕"/>
-          <w:b w:val="0"/>
-          <w:color w:val="1C1C1C"/>
-          <w:sz w:val="22"/>
-        </w:rPr>
-        <w:t>코드·사진은 GitHub에 공개되어 있습니다.</w:t>
-      </w:r>
-    </w:p>
-    <w:p>
-      <w:pPr>
-        <w:spacing w:after="240" w:line="324" w:lineRule="auto"/>
+        <w:spacing w:after="160" w:line="336" w:lineRule="auto"/>
       </w:pPr>
       <w:r>
         <w:rPr>
@@ -104,16 +104,85 @@
     </w:p>
     <w:p>
       <w:pPr>
-        <w:spacing w:after="200" w:line="324" w:lineRule="auto"/>
+        <w:pStyle w:val="ListNumber"/>
+        <w:spacing w:after="100"/>
+      </w:pPr>
+      <w:r>
+        <w:rPr>
+          <w:rFonts w:ascii="맑은 고딕" w:hAnsi="맑은 고딕" w:eastAsia="맑은 고딕"/>
+          <w:b w:val="0"/>
+          <w:sz w:val="22"/>
+        </w:rPr>
+        <w:t>위 주소 들어가기</w:t>
+      </w:r>
+    </w:p>
+    <w:p>
+      <w:pPr>
+        <w:pStyle w:val="ListNumber"/>
+        <w:spacing w:after="100"/>
+      </w:pPr>
+      <w:r>
+        <w:rPr>
+          <w:rFonts w:ascii="맑은 고딕" w:hAnsi="맑은 고딕" w:eastAsia="맑은 고딕"/>
+          <w:b w:val="0"/>
+          <w:sz w:val="22"/>
+        </w:rPr>
+        <w:t>초록 Code 버튼 → Download ZIP (또는 Clone)</w:t>
+      </w:r>
+    </w:p>
+    <w:p>
+      <w:pPr>
+        <w:pStyle w:val="ListNumber"/>
+        <w:spacing w:after="100"/>
+      </w:pPr>
+      <w:r>
+        <w:rPr>
+          <w:rFonts w:ascii="맑은 고딕" w:hAnsi="맑은 고딕" w:eastAsia="맑은 고딕"/>
+          <w:b w:val="0"/>
+          <w:sz w:val="22"/>
+        </w:rPr>
+        <w:t>압축 풀고 폴더를 연다</w:t>
+      </w:r>
+    </w:p>
+    <w:p>
+      <w:pPr>
+        <w:spacing w:after="80" w:line="336" w:lineRule="auto"/>
+      </w:pPr>
+      <w:r>
+        <w:rPr>
+          <w:rFonts w:ascii="맑은 고딕" w:hAnsi="맑은 고딕" w:eastAsia="맑은 고딕"/>
+          <w:b w:val="0"/>
+          <w:color w:val="1C1C1C"/>
+          <w:sz w:val="22"/>
+        </w:rPr>
+      </w:r>
+    </w:p>
+    <w:p>
+      <w:pPr>
+        <w:spacing w:after="160" w:line="336" w:lineRule="auto"/>
       </w:pPr>
       <w:r>
         <w:rPr>
           <w:rFonts w:ascii="맑은 고딕" w:hAnsi="맑은 고딕" w:eastAsia="맑은 고딕"/>
           <w:b/>
           <w:color w:val="1C1C1C"/>
-          <w:sz w:val="32"/>
+          <w:sz w:val="30"/>
         </w:rPr>
-        <w:t>2. 어디에 무엇이 있나요?</w:t>
+        <w:t>2. AI한테 시키기</w:t>
+      </w:r>
+    </w:p>
+    <w:p>
+      <w:pPr>
+        <w:spacing w:after="160" w:line="336" w:lineRule="auto"/>
+      </w:pPr>
+      <w:r>
+        <w:rPr>
+          <w:rFonts w:ascii="맑은 고딕" w:hAnsi="맑은 고딕" w:eastAsia="맑은 고딕"/>
+          <w:b w:val="0"/>
+          <w:color w:val="1C1C1C"/>
+          <w:sz w:val="22"/>
+        </w:rPr>
+        <w:t>Cursor든 Claude Code든 VS Code + AI든, 익숙한 걸로 폴더를 연 다음 원하는 말을 하면 됩니다. 예:</w:t>
       </w:r>
     </w:p>
     <w:p>
@@ -127,7 +196,7 @@
           <w:b w:val="0"/>
           <w:sz w:val="22"/>
         </w:rPr>
-        <w:t>src/components/RulesChapter.tsx  →  작업 수칙 글·순서 (가장 자주 고침)</w:t>
+        <w:t>수칙 05에 박스 예시 문장 추가해줘</w:t>
       </w:r>
     </w:p>
     <w:p>
@@ -141,7 +210,7 @@
           <w:b w:val="0"/>
           <w:sz w:val="22"/>
         </w:rPr>
-        <w:t>src/components/MapChapter.tsx  →  창고 도면 화면</w:t>
+        <w:t>이 사진으로 가벼운 박스 예시 바꿔줘</w:t>
       </w:r>
     </w:p>
     <w:p>
@@ -155,7 +224,49 @@
           <w:b w:val="0"/>
           <w:sz w:val="22"/>
         </w:rPr>
-        <w:t>src/components/CoverChapter.tsx  →  시작 화면</w:t>
+        <w:t>워드 메뉴얼도 웹이랑 맞게 다시 만들어줘</w:t>
+      </w:r>
+    </w:p>
+    <w:p>
+      <w:pPr>
+        <w:spacing w:after="280" w:line="336" w:lineRule="auto"/>
+      </w:pPr>
+      <w:r>
+        <w:rPr>
+          <w:rFonts w:ascii="맑은 고딕" w:hAnsi="맑은 고딕" w:eastAsia="맑은 고딕"/>
+          <w:b w:val="0"/>
+          <w:color w:val="646464"/>
+          <w:sz w:val="20"/>
+        </w:rPr>
+        <w:t>어디 파일을 고칠지 외울 필요 없습니다. AI가 찾아서 고칩니다.</w:t>
+      </w:r>
+    </w:p>
+    <w:p>
+      <w:pPr>
+        <w:spacing w:after="160" w:line="336" w:lineRule="auto"/>
+      </w:pPr>
+      <w:r>
+        <w:rPr>
+          <w:rFonts w:ascii="맑은 고딕" w:hAnsi="맑은 고딕" w:eastAsia="맑은 고딕"/>
+          <w:b/>
+          <w:color w:val="1C1C1C"/>
+          <w:sz w:val="30"/>
+        </w:rPr>
+        <w:t>3. 결과물 어디에 올리나? (편한 걸로)</w:t>
+      </w:r>
+    </w:p>
+    <w:p>
+      <w:pPr>
+        <w:spacing w:after="160" w:line="336" w:lineRule="auto"/>
+      </w:pPr>
+      <w:r>
+        <w:rPr>
+          <w:rFonts w:ascii="맑은 고딕" w:hAnsi="맑은 고딕" w:eastAsia="맑은 고딕"/>
+          <w:b w:val="0"/>
+          <w:color w:val="1C1C1C"/>
+          <w:sz w:val="22"/>
+        </w:rPr>
+        <w:t>공식 사이트에 꼭 올릴 필요 없습니다. 아래 중 하나면 됩니다.</w:t>
       </w:r>
     </w:p>
     <w:p>
@@ -169,7 +280,7 @@
           <w:b w:val="0"/>
           <w:sz w:val="22"/>
         </w:rPr>
-        <w:t>public/labels/  →  사진·라벨 이미지 (png)</w:t>
+        <w:t>지금 쓰는 공식 웹: https://wac-warehouse-manual.vercel.app (권한 있으면 GitHub에 올린 뒤 반영)</w:t>
       </w:r>
     </w:p>
     <w:p>
@@ -183,353 +294,7 @@
           <w:b w:val="0"/>
           <w:sz w:val="22"/>
         </w:rPr>
-        <w:t>scripts/build_word_manual.py  →  인쇄용 Word 메뉴얼 다시 만들기</w:t>
-      </w:r>
-    </w:p>
-    <w:p>
-      <w:pPr>
-        <w:spacing w:after="80" w:line="324" w:lineRule="auto"/>
-      </w:pPr>
-      <w:r>
-        <w:rPr>
-          <w:rFonts w:ascii="맑은 고딕" w:hAnsi="맑은 고딕" w:eastAsia="맑은 고딕"/>
-          <w:b w:val="0"/>
-          <w:color w:val="1C1C1C"/>
-          <w:sz w:val="22"/>
-        </w:rPr>
-      </w:r>
-    </w:p>
-    <w:p>
-      <w:pPr>
-        <w:spacing w:after="200" w:line="324" w:lineRule="auto"/>
-      </w:pPr>
-      <w:r>
-        <w:rPr>
-          <w:rFonts w:ascii="맑은 고딕" w:hAnsi="맑은 고딕" w:eastAsia="맑은 고딕"/>
-          <w:b/>
-          <w:color w:val="1C1C1C"/>
-          <w:sz w:val="32"/>
-        </w:rPr>
-        <w:t>3. 글만 고치고 싶을 때 (제일 흔함)</w:t>
-      </w:r>
-    </w:p>
-    <w:p>
-      <w:pPr>
-        <w:pStyle w:val="ListNumber"/>
-        <w:spacing w:after="100"/>
-      </w:pPr>
-      <w:r>
-        <w:rPr>
-          <w:rFonts w:ascii="맑은 고딕" w:hAnsi="맑은 고딕" w:eastAsia="맑은 고딕"/>
-          <w:b w:val="0"/>
-          <w:sz w:val="22"/>
-        </w:rPr>
-        <w:t>GitHub에서 wac-manual 저장소를 연다</w:t>
-      </w:r>
-    </w:p>
-    <w:p>
-      <w:pPr>
-        <w:pStyle w:val="ListNumber"/>
-        <w:spacing w:after="100"/>
-      </w:pPr>
-      <w:r>
-        <w:rPr>
-          <w:rFonts w:ascii="맑은 고딕" w:hAnsi="맑은 고딕" w:eastAsia="맑은 고딕"/>
-          <w:b w:val="0"/>
-          <w:sz w:val="22"/>
-        </w:rPr>
-        <w:t>src/components/RulesChapter.tsx 파일을 연다</w:t>
-      </w:r>
-    </w:p>
-    <w:p>
-      <w:pPr>
-        <w:pStyle w:val="ListNumber"/>
-        <w:spacing w:after="100"/>
-      </w:pPr>
-      <w:r>
-        <w:rPr>
-          <w:rFonts w:ascii="맑은 고딕" w:hAnsi="맑은 고딕" w:eastAsia="맑은 고딕"/>
-          <w:b w:val="0"/>
-          <w:sz w:val="22"/>
-        </w:rPr>
-        <w:t>원하는 문장을 고친다 (규칙 제목·설명·순서)</w:t>
-      </w:r>
-    </w:p>
-    <w:p>
-      <w:pPr>
-        <w:pStyle w:val="ListNumber"/>
-        <w:spacing w:after="100"/>
-      </w:pPr>
-      <w:r>
-        <w:rPr>
-          <w:rFonts w:ascii="맑은 고딕" w:hAnsi="맑은 고딕" w:eastAsia="맑은 고딕"/>
-          <w:b w:val="0"/>
-          <w:sz w:val="22"/>
-        </w:rPr>
-        <w:t>Commit changes → main에 저장</w:t>
-      </w:r>
-    </w:p>
-    <w:p>
-      <w:pPr>
-        <w:pStyle w:val="ListNumber"/>
-        <w:spacing w:after="100"/>
-      </w:pPr>
-      <w:r>
-        <w:rPr>
-          <w:rFonts w:ascii="맑은 고딕" w:hAnsi="맑은 고딕" w:eastAsia="맑은 고딕"/>
-          <w:b w:val="0"/>
-          <w:sz w:val="22"/>
-        </w:rPr>
-        <w:t>1~2분 후 웹사이트(Vercel)에 자동 반영되는지 확인</w:t>
-      </w:r>
-    </w:p>
-    <w:p>
-      <w:pPr>
-        <w:spacing w:after="240" w:line="324" w:lineRule="auto"/>
-      </w:pPr>
-      <w:r>
-        <w:rPr>
-          <w:rFonts w:ascii="맑은 고딕" w:hAnsi="맑은 고딕" w:eastAsia="맑은 고딕"/>
-          <w:b w:val="0"/>
-          <w:color w:val="646464"/>
-          <w:sz w:val="20"/>
-        </w:rPr>
-        <w:t>Tip: RULE_PAGES 배열 안에 규칙이 페이지 단위로 들어 있습니다. 새 규칙은 그 배열에 항목을 추가하면 됩니다.</w:t>
-      </w:r>
-    </w:p>
-    <w:p>
-      <w:pPr>
-        <w:spacing w:after="200" w:line="324" w:lineRule="auto"/>
-      </w:pPr>
-      <w:r>
-        <w:rPr>
-          <w:rFonts w:ascii="맑은 고딕" w:hAnsi="맑은 고딕" w:eastAsia="맑은 고딕"/>
-          <w:b/>
-          <w:color w:val="1C1C1C"/>
-          <w:sz w:val="32"/>
-        </w:rPr>
-        <w:t>4. 사진을 바꾸고 싶을 때</w:t>
-      </w:r>
-    </w:p>
-    <w:p>
-      <w:pPr>
-        <w:pStyle w:val="ListNumber"/>
-        <w:spacing w:after="100"/>
-      </w:pPr>
-      <w:r>
-        <w:rPr>
-          <w:rFonts w:ascii="맑은 고딕" w:hAnsi="맑은 고딕" w:eastAsia="맑은 고딕"/>
-          <w:b w:val="0"/>
-          <w:sz w:val="22"/>
-        </w:rPr>
-        <w:t>새 사진을 public/labels/ 폴더에 넣는다 (예: my-photo.png)</w:t>
-      </w:r>
-    </w:p>
-    <w:p>
-      <w:pPr>
-        <w:pStyle w:val="ListNumber"/>
-        <w:spacing w:after="100"/>
-      </w:pPr>
-      <w:r>
-        <w:rPr>
-          <w:rFonts w:ascii="맑은 고딕" w:hAnsi="맑은 고딕" w:eastAsia="맑은 고딕"/>
-          <w:b w:val="0"/>
-          <w:sz w:val="22"/>
-        </w:rPr>
-        <w:t>RulesChapter.tsx에서 이미지 경로를 /labels/my-photo.png 로 바꾼다</w:t>
-      </w:r>
-    </w:p>
-    <w:p>
-      <w:pPr>
-        <w:pStyle w:val="ListNumber"/>
-        <w:spacing w:after="100"/>
-      </w:pPr>
-      <w:r>
-        <w:rPr>
-          <w:rFonts w:ascii="맑은 고딕" w:hAnsi="맑은 고딕" w:eastAsia="맑은 고딕"/>
-          <w:b w:val="0"/>
-          <w:sz w:val="22"/>
-        </w:rPr>
-        <w:t>GitHub에 커밋하면 웹에 반영된다</w:t>
-      </w:r>
-    </w:p>
-    <w:p>
-      <w:pPr>
-        <w:spacing w:after="80" w:line="324" w:lineRule="auto"/>
-      </w:pPr>
-      <w:r>
-        <w:rPr>
-          <w:rFonts w:ascii="맑은 고딕" w:hAnsi="맑은 고딕" w:eastAsia="맑은 고딕"/>
-          <w:b w:val="0"/>
-          <w:color w:val="1C1C1C"/>
-          <w:sz w:val="22"/>
-        </w:rPr>
-      </w:r>
-    </w:p>
-    <w:p>
-      <w:pPr>
-        <w:spacing w:after="200" w:line="324" w:lineRule="auto"/>
-      </w:pPr>
-      <w:r>
-        <w:rPr>
-          <w:rFonts w:ascii="맑은 고딕" w:hAnsi="맑은 고딕" w:eastAsia="맑은 고딕"/>
-          <w:b/>
-          <w:color w:val="1C1C1C"/>
-          <w:sz w:val="32"/>
-        </w:rPr>
-        <w:t>5. 인쇄용 Word도 같이 고치려면</w:t>
-      </w:r>
-    </w:p>
-    <w:p>
-      <w:pPr>
-        <w:pStyle w:val="ListNumber"/>
-        <w:spacing w:after="100"/>
-      </w:pPr>
-      <w:r>
-        <w:rPr>
-          <w:rFonts w:ascii="맑은 고딕" w:hAnsi="맑은 고딕" w:eastAsia="맑은 고딕"/>
-          <w:b w:val="0"/>
-          <w:sz w:val="22"/>
-        </w:rPr>
-        <w:t>scripts/build_word_manual.py 내용도 웹과 맞게 수정</w:t>
-      </w:r>
-    </w:p>
-    <w:p>
-      <w:pPr>
-        <w:pStyle w:val="ListNumber"/>
-        <w:spacing w:after="100"/>
-      </w:pPr>
-      <w:r>
-        <w:rPr>
-          <w:rFonts w:ascii="맑은 고딕" w:hAnsi="맑은 고딕" w:eastAsia="맑은 고딕"/>
-          <w:b w:val="0"/>
-          <w:sz w:val="22"/>
-        </w:rPr>
-        <w:t>컴퓨터에 Python + python-docx 설치 후 실행:</w:t>
-      </w:r>
-    </w:p>
-    <w:p>
-      <w:pPr>
-        <w:spacing w:after="120" w:line="324" w:lineRule="auto"/>
-      </w:pPr>
-      <w:r>
-        <w:rPr>
-          <w:rFonts w:ascii="맑은 고딕" w:hAnsi="맑은 고딕" w:eastAsia="맑은 고딕"/>
-          <w:b/>
-          <w:color w:val="1C1C1C"/>
-          <w:sz w:val="20"/>
-        </w:rPr>
-        <w:t>python scripts/build_word_manual.py</w:t>
-      </w:r>
-    </w:p>
-    <w:p>
-      <w:pPr>
-        <w:pStyle w:val="ListNumber"/>
-        <w:spacing w:after="100"/>
-      </w:pPr>
-      <w:r>
-        <w:rPr>
-          <w:rFonts w:ascii="맑은 고딕" w:hAnsi="맑은 고딕" w:eastAsia="맑은 고딕"/>
-          <w:b w:val="0"/>
-          <w:sz w:val="22"/>
-        </w:rPr>
-        <w:t>만들어진 WAC_창고_업무_메뉴얼.docx 를 확인·배포</w:t>
-      </w:r>
-    </w:p>
-    <w:p>
-      <w:pPr>
-        <w:spacing w:after="80" w:line="324" w:lineRule="auto"/>
-      </w:pPr>
-      <w:r>
-        <w:rPr>
-          <w:rFonts w:ascii="맑은 고딕" w:hAnsi="맑은 고딕" w:eastAsia="맑은 고딕"/>
-          <w:b w:val="0"/>
-          <w:color w:val="1C1C1C"/>
-          <w:sz w:val="22"/>
-        </w:rPr>
-      </w:r>
-    </w:p>
-    <w:p>
-      <w:pPr>
-        <w:spacing w:after="200" w:line="324" w:lineRule="auto"/>
-      </w:pPr>
-      <w:r>
-        <w:rPr>
-          <w:rFonts w:ascii="맑은 고딕" w:hAnsi="맑은 고딕" w:eastAsia="맑은 고딕"/>
-          <w:b/>
-          <w:color w:val="1C1C1C"/>
-          <w:sz w:val="32"/>
-        </w:rPr>
-        <w:t>6. 로컬에서 미리보기 (선택)</w:t>
-      </w:r>
-    </w:p>
-    <w:p>
-      <w:pPr>
-        <w:pStyle w:val="ListNumber"/>
-        <w:spacing w:after="100"/>
-      </w:pPr>
-      <w:r>
-        <w:rPr>
-          <w:rFonts w:ascii="맑은 고딕" w:hAnsi="맑은 고딕" w:eastAsia="맑은 고딕"/>
-          <w:b w:val="0"/>
-          <w:sz w:val="22"/>
-        </w:rPr>
-        <w:t>저장소를 내 컴퓨터에 Clone</w:t>
-      </w:r>
-    </w:p>
-    <w:p>
-      <w:pPr>
-        <w:pStyle w:val="ListNumber"/>
-        <w:spacing w:after="100"/>
-      </w:pPr>
-      <w:r>
-        <w:rPr>
-          <w:rFonts w:ascii="맑은 고딕" w:hAnsi="맑은 고딕" w:eastAsia="맑은 고딕"/>
-          <w:b w:val="0"/>
-          <w:sz w:val="22"/>
-        </w:rPr>
-        <w:t>폴더에서 npm install</w:t>
-      </w:r>
-    </w:p>
-    <w:p>
-      <w:pPr>
-        <w:pStyle w:val="ListNumber"/>
-        <w:spacing w:after="100"/>
-      </w:pPr>
-      <w:r>
-        <w:rPr>
-          <w:rFonts w:ascii="맑은 고딕" w:hAnsi="맑은 고딕" w:eastAsia="맑은 고딕"/>
-          <w:b w:val="0"/>
-          <w:sz w:val="22"/>
-        </w:rPr>
-        <w:t>npm run dev 실행 후 브라우저에서 확인</w:t>
-      </w:r>
-    </w:p>
-    <w:p>
-      <w:pPr>
-        <w:spacing w:after="80" w:line="324" w:lineRule="auto"/>
-      </w:pPr>
-      <w:r>
-        <w:rPr>
-          <w:rFonts w:ascii="맑은 고딕" w:hAnsi="맑은 고딕" w:eastAsia="맑은 고딕"/>
-          <w:b w:val="0"/>
-          <w:color w:val="1C1C1C"/>
-          <w:sz w:val="22"/>
-        </w:rPr>
-      </w:r>
-    </w:p>
-    <w:p>
-      <w:pPr>
-        <w:spacing w:after="200" w:line="324" w:lineRule="auto"/>
-      </w:pPr>
-      <w:r>
-        <w:rPr>
-          <w:rFonts w:ascii="맑은 고딕" w:hAnsi="맑은 고딕" w:eastAsia="맑은 고딕"/>
-          <w:b/>
-          <w:color w:val="1C1C1C"/>
-          <w:sz w:val="32"/>
-        </w:rPr>
-        <w:t>7. 막히면</w:t>
+        <w:t>본인 Vercel에 따로 배포해도 됨</w:t>
       </w:r>
     </w:p>
     <w:p>
@@ -543,7 +308,35 @@
           <w:b w:val="0"/>
           <w:sz w:val="22"/>
         </w:rPr>
-        <w:t>GitHub 저장소 Issues에 메모를 남기거나</w:t>
+        <w:t>고친 파일·Word만 구글 드라이브 / 카톡으로 공유해도 됨</w:t>
+      </w:r>
+    </w:p>
+    <w:p>
+      <w:pPr>
+        <w:spacing w:after="280" w:line="336" w:lineRule="auto"/>
+      </w:pPr>
+      <w:r>
+        <w:rPr>
+          <w:rFonts w:ascii="맑은 고딕" w:hAnsi="맑은 고딕" w:eastAsia="맑은 고딕"/>
+          <w:b w:val="0"/>
+          <w:color w:val="646464"/>
+          <w:sz w:val="20"/>
+        </w:rPr>
+        <w:t>배포·권한 설정이 어렵면 드라이브로 넘기면 됩니다.</w:t>
+      </w:r>
+    </w:p>
+    <w:p>
+      <w:pPr>
+        <w:spacing w:after="160" w:line="336" w:lineRule="auto"/>
+      </w:pPr>
+      <w:r>
+        <w:rPr>
+          <w:rFonts w:ascii="맑은 고딕" w:hAnsi="맑은 고딕" w:eastAsia="맑은 고딕"/>
+          <w:b/>
+          <w:color w:val="1C1C1C"/>
+          <w:sz w:val="30"/>
+        </w:rPr>
+        <w:t>4. 참고 (필요할 때만)</w:t>
       </w:r>
     </w:p>
     <w:p>
@@ -557,7 +350,7 @@
           <w:b w:val="0"/>
           <w:sz w:val="22"/>
         </w:rPr>
-        <w:t>Cursor / VS Code로 폴더를 열고 RulesChapter.tsx만 검색해서 수정</w:t>
+        <w:t>웹 주소: https://wac-warehouse-manual.vercel.app</w:t>
       </w:r>
     </w:p>
     <w:p>
@@ -571,12 +364,26 @@
           <w:b w:val="0"/>
           <w:sz w:val="22"/>
         </w:rPr>
-        <w:t>Vercel 대시보드에서 최근 Deploy가 성공했는지 확인</w:t>
+        <w:t>인쇄용 Word: 보통 WAC_창고_업무_메뉴얼.docx</w:t>
       </w:r>
     </w:p>
     <w:p>
       <w:pPr>
-        <w:spacing w:after="160" w:line="324" w:lineRule="auto"/>
+        <w:pStyle w:val="ListBullet"/>
+        <w:spacing w:after="80"/>
+      </w:pPr>
+      <w:r>
+        <w:rPr>
+          <w:rFonts w:ascii="맑은 고딕" w:hAnsi="맑은 고딕" w:eastAsia="맑은 고딕"/>
+          <w:b w:val="0"/>
+          <w:sz w:val="22"/>
+        </w:rPr>
+        <w:t>로컬로 화면만 보려면: npm install → npm run dev</w:t>
+      </w:r>
+    </w:p>
+    <w:p>
+      <w:pPr>
+        <w:spacing w:after="200" w:line="336" w:lineRule="auto"/>
       </w:pPr>
       <w:r>
         <w:rPr>
@@ -589,7 +396,7 @@
     </w:p>
     <w:p>
       <w:pPr>
-        <w:spacing w:after="80" w:line="324" w:lineRule="auto"/>
+        <w:spacing w:after="80" w:line="336" w:lineRule="auto"/>
       </w:pPr>
       <w:r>
         <w:rPr>
@@ -598,7 +405,7 @@
           <w:color w:val="1C1C1C"/>
           <w:sz w:val="24"/>
         </w:rPr>
-        <w:t>핵심 한 줄: 글·사진은 GitHub에서 고치면 → Vercel 웹이 따라 업데이트됩니다.</w:t>
+        <w:t>핵심: 다운받기 → AI에게 말하기 → 드라이브든 본인 배포든 편한 방식으로 공유.</w:t>
       </w:r>
     </w:p>
     <w:sectPr>

</xml_diff>